<commit_message>
Updated References, Validated uSD Cards, installed OS.
</commit_message>
<xml_diff>
--- a/Frequency_Survey/ChatGPT_Feequency_Survey_Background.docx
+++ b/Frequency_Survey/ChatGPT_Feequency_Survey_Background.docx
@@ -1749,7 +1749,68 @@
       <w:r>
         <w:t>Would you like this exported as a PDF file or with a radio programming table layout as well?</w:t>
       </w:r>
-    </w:p>
+      <w:r>
+        <w:br/>
+      </w:r>
+    </w:p>
+    <w:p/>
+    <w:p>
+      <w:r>
+        <w:br w:type="page"/>
+      </w:r>
+    </w:p>
+    <w:p>
+      <w:r>
+        <w:lastRenderedPageBreak/>
+        <w:t>Suggested Frequencies for D-Star Hotspot</w:t>
+      </w:r>
+    </w:p>
+    <w:p/>
+    <w:p>
+      <w:r>
+        <w:t>433.000</w:t>
+      </w:r>
+    </w:p>
+    <w:p>
+      <w:r>
+        <w:t>433.050</w:t>
+      </w:r>
+    </w:p>
+    <w:p>
+      <w:r>
+        <w:t>433.1</w:t>
+      </w:r>
+      <w:r>
+        <w:t>00</w:t>
+      </w:r>
+    </w:p>
+    <w:p>
+      <w:r>
+        <w:t>433.450</w:t>
+      </w:r>
+    </w:p>
+    <w:p>
+      <w:r>
+        <w:t>434.000</w:t>
+      </w:r>
+    </w:p>
+    <w:p>
+      <w:r>
+        <w:t>446.500</w:t>
+      </w:r>
+    </w:p>
+    <w:p>
+      <w:r>
+        <w:t>446.525</w:t>
+      </w:r>
+    </w:p>
+    <w:p>
+      <w:r>
+        <w:t>446.550</w:t>
+      </w:r>
+    </w:p>
+    <w:p/>
+    <w:p/>
     <w:p>
       <w:r>
         <w:t> </w:t>
@@ -2850,6 +2911,7 @@
   <w:style w:type="character" w:default="1" w:styleId="DefaultParagraphFont">
     <w:name w:val="Default Paragraph Font"/>
     <w:uiPriority w:val="1"/>
+    <w:semiHidden/>
     <w:unhideWhenUsed/>
   </w:style>
   <w:style w:type="table" w:default="1" w:styleId="TableNormal">

</xml_diff>